<commit_message>
RA2: afegeix hipervincles a les fonts citades (sense canviar contingut)
Recupera els enllaços del repositori SMX-0226SI/Materials (NF2) que
s'havien perdut en adaptar el material: només s'enllaça text ja existent,
sense modificar-ne cap paraula. Aplicat als temaris (.md i .docx), als
exercicis i pràctiques (.docx i .pdf) i a les presentacions (.pptx).

Co-Authored-By: Claude Opus 5.5 <noreply@anthropic.com>
Claude-Session: https://claude.ai/code/session_01BodJZ9PsepvknsFhsdyYkP
</commit_message>
<xml_diff>
--- a/RA2 - Emmagatzematge i copies de seguretat/AA1 - Protegint les dades/A03_Exercicis_Protegint_les_dades.docx
+++ b/RA2 - Emmagatzematge i copies de seguretat/AA1 - Protegint les dades/A03_Exercicis_Protegint_les_dades.docx
@@ -216,7 +216,85 @@
           <w:sz w:val="20"/>
           <w:szCs w:val="20"/>
         </w:rPr>
-        <w:t xml:space="preserve">Fonts: Repositori "Materials" (GitHub, SMX-0226SI), NF2/AA1-ProtegintDades.md — Carlos Alonso Martínez, Escola Pia de Mataró (CC-BY-SA-4.0); PCMag, "Many Used Hard Drives Sold on eBay Still Contain Leftover Data" (2019); IONOS Digital Guide, "La importancia de contar con un disaster recovery plan".</w:t>
+        <w:t xml:space="preserve">Fonts: Repositori "Materials" (GitHub, SMX-0226SI), </w:t>
+      </w:r>
+      <w:hyperlink r:id="rId8">
+        <w:r>
+          <w:rPr>
+            <w:b/>
+            <w:bCs/>
+            <w:i/>
+            <w:iCs/>
+            <w:sz w:val="20"/>
+            <w:szCs w:val="20"/>
+            <w:color w:val="0563C1"/>
+            <w:u w:val="single"/>
+          </w:rPr>
+          <w:t xml:space="preserve">NF2/AA1-ProtegintDades.md</w:t>
+        </w:r>
+      </w:hyperlink>
+      <w:r>
+        <w:rPr>
+          <w:b/>
+          <w:bCs/>
+          <w:i/>
+          <w:iCs/>
+          <w:sz w:val="20"/>
+          <w:szCs w:val="20"/>
+        </w:rPr>
+        <w:t xml:space="preserve"> — Carlos Alonso Martínez, Escola Pia de Mataró (CC-BY-SA-4.0); PCMag, </w:t>
+      </w:r>
+      <w:hyperlink r:id="rId9">
+        <w:r>
+          <w:rPr>
+            <w:b/>
+            <w:bCs/>
+            <w:i/>
+            <w:iCs/>
+            <w:sz w:val="20"/>
+            <w:szCs w:val="20"/>
+            <w:color w:val="0563C1"/>
+            <w:u w:val="single"/>
+          </w:rPr>
+          <w:t xml:space="preserve">"Many Used Hard Drives Sold on eBay Still Contain Leftover Data"</w:t>
+        </w:r>
+      </w:hyperlink>
+      <w:r>
+        <w:rPr>
+          <w:b/>
+          <w:bCs/>
+          <w:i/>
+          <w:iCs/>
+          <w:sz w:val="20"/>
+          <w:szCs w:val="20"/>
+        </w:rPr>
+        <w:t xml:space="preserve"> (2019); IONOS Digital Guide, </w:t>
+      </w:r>
+      <w:hyperlink r:id="rId10">
+        <w:r>
+          <w:rPr>
+            <w:b/>
+            <w:bCs/>
+            <w:i/>
+            <w:iCs/>
+            <w:sz w:val="20"/>
+            <w:szCs w:val="20"/>
+            <w:color w:val="0563C1"/>
+            <w:u w:val="single"/>
+          </w:rPr>
+          <w:t xml:space="preserve">"La importancia de contar con un disaster recovery plan"</w:t>
+        </w:r>
+      </w:hyperlink>
+      <w:r>
+        <w:rPr>
+          <w:b/>
+          <w:bCs/>
+          <w:i/>
+          <w:iCs/>
+          <w:sz w:val="20"/>
+          <w:szCs w:val="20"/>
+        </w:rPr>
+        <w:t xml:space="preserve">.</w:t>
       </w:r>
     </w:p>
     <w:sectPr>

</xml_diff>

<commit_message>
RA2: aplica la plantilla dels dossiers de RA1 a A04-A07 (només format)
Mateix format que l'A03: capçalera amb logotip, taula de capçalera (RA
oficial, GRUP "SMX2_"), enunciats/parts en caselles, peu amb numeració,
subapartats en línies separades amb la lletra en negreta i espai entre
paràgrafs. Els blocs d'ordres i les captures es conserven tal qual.
Text, imatges, enllaços i ordres idèntics a l'original.

Co-Authored-By: Claude Opus 5.5 <noreply@anthropic.com>
Claude-Session: https://claude.ai/code/session_01BodJZ9PsepvknsFhsdyYkP
</commit_message>
<xml_diff>
--- a/RA2 - Emmagatzematge i copies de seguretat/AA1 - Protegint les dades/A03_Exercicis_Protegint_les_dades.docx
+++ b/RA2 - Emmagatzematge i copies de seguretat/AA1 - Protegint les dades/A03_Exercicis_Protegint_les_dades.docx
@@ -475,7 +475,7 @@
           <w:p>
             <w:pPr>
               <w:widowControl w:val="1"/>
-              <w:spacing w:line="240" w:lineRule="auto"/>
+              <w:spacing w:line="240" w:lineRule="auto" w:after="100"/>
               <w:rPr>
                 <w:color w:val="1155cc"/>
                 <w:sz w:val="20"/>
@@ -587,7 +587,7 @@
           <w:p>
             <w:pPr>
               <w:widowControl w:val="1"/>
-              <w:spacing w:line="240" w:lineRule="auto" w:before="0" w:after="0"/>
+              <w:spacing w:line="240" w:lineRule="auto" w:after="0" w:before="0"/>
               <w:rPr>
                 <w:color w:val="1155cc"/>
                 <w:sz w:val="20"/>
@@ -606,7 +606,7 @@
           <w:p>
             <w:pPr>
               <w:widowControl w:val="1"/>
-              <w:spacing w:line="240" w:lineRule="auto" w:before="140" w:after="0"/>
+              <w:spacing w:line="240" w:lineRule="auto" w:after="0" w:before="100"/>
               <w:ind w:left="340" w:hanging="340"/>
               <w:rPr>
                 <w:color w:val="1155cc"/>
@@ -636,7 +636,7 @@
           <w:p>
             <w:pPr>
               <w:widowControl w:val="1"/>
-              <w:spacing w:line="240" w:lineRule="auto" w:before="140" w:after="0"/>
+              <w:spacing w:line="240" w:lineRule="auto" w:after="100" w:before="100"/>
               <w:ind w:left="340" w:hanging="340"/>
               <w:rPr>
                 <w:color w:val="1155cc"/>
@@ -759,7 +759,7 @@
           <w:p>
             <w:pPr>
               <w:widowControl w:val="1"/>
-              <w:spacing w:line="240" w:lineRule="auto" w:before="0" w:after="0"/>
+              <w:spacing w:line="240" w:lineRule="auto" w:after="0" w:before="0"/>
               <w:rPr>
                 <w:color w:val="1155cc"/>
                 <w:sz w:val="20"/>
@@ -778,7 +778,7 @@
           <w:p>
             <w:pPr>
               <w:widowControl w:val="1"/>
-              <w:spacing w:line="240" w:lineRule="auto" w:before="140" w:after="0"/>
+              <w:spacing w:line="240" w:lineRule="auto" w:after="0" w:before="100"/>
               <w:ind w:left="340" w:hanging="340"/>
               <w:rPr>
                 <w:color w:val="1155cc"/>
@@ -808,7 +808,7 @@
           <w:p>
             <w:pPr>
               <w:widowControl w:val="1"/>
-              <w:spacing w:line="240" w:lineRule="auto" w:before="140" w:after="0"/>
+              <w:spacing w:line="240" w:lineRule="auto" w:after="0" w:before="100"/>
               <w:ind w:left="340" w:hanging="340"/>
               <w:rPr>
                 <w:color w:val="1155cc"/>
@@ -838,7 +838,7 @@
           <w:p>
             <w:pPr>
               <w:widowControl w:val="1"/>
-              <w:spacing w:line="240" w:lineRule="auto" w:before="140" w:after="0"/>
+              <w:spacing w:line="240" w:lineRule="auto" w:after="100" w:before="100"/>
               <w:ind w:left="340" w:hanging="340"/>
               <w:rPr>
                 <w:color w:val="1155cc"/>
@@ -961,7 +961,7 @@
           <w:p>
             <w:pPr>
               <w:widowControl w:val="1"/>
-              <w:spacing w:line="240" w:lineRule="auto" w:before="0" w:after="0"/>
+              <w:spacing w:line="240" w:lineRule="auto" w:after="0" w:before="0"/>
               <w:rPr>
                 <w:color w:val="1155cc"/>
                 <w:sz w:val="20"/>
@@ -980,7 +980,7 @@
           <w:p>
             <w:pPr>
               <w:widowControl w:val="1"/>
-              <w:spacing w:line="240" w:lineRule="auto" w:before="140" w:after="0"/>
+              <w:spacing w:line="240" w:lineRule="auto" w:after="0" w:before="100"/>
               <w:ind w:left="340" w:hanging="340"/>
               <w:rPr>
                 <w:color w:val="1155cc"/>
@@ -1010,7 +1010,7 @@
           <w:p>
             <w:pPr>
               <w:widowControl w:val="1"/>
-              <w:spacing w:line="240" w:lineRule="auto" w:before="140" w:after="0"/>
+              <w:spacing w:line="240" w:lineRule="auto" w:after="0" w:before="100"/>
               <w:ind w:left="340" w:hanging="340"/>
               <w:rPr>
                 <w:color w:val="1155cc"/>
@@ -1040,7 +1040,7 @@
           <w:p>
             <w:pPr>
               <w:widowControl w:val="1"/>
-              <w:spacing w:line="240" w:lineRule="auto" w:before="140" w:after="0"/>
+              <w:spacing w:line="240" w:lineRule="auto" w:after="100" w:before="100"/>
               <w:ind w:left="340" w:hanging="340"/>
               <w:rPr>
                 <w:color w:val="1155cc"/>
@@ -1163,7 +1163,7 @@
           <w:p>
             <w:pPr>
               <w:widowControl w:val="1"/>
-              <w:spacing w:line="240" w:lineRule="auto" w:before="0" w:after="0"/>
+              <w:spacing w:line="240" w:lineRule="auto" w:after="0" w:before="0"/>
               <w:rPr>
                 <w:color w:val="1155cc"/>
                 <w:sz w:val="20"/>
@@ -1182,7 +1182,7 @@
           <w:p>
             <w:pPr>
               <w:widowControl w:val="1"/>
-              <w:spacing w:line="240" w:lineRule="auto" w:before="140" w:after="0"/>
+              <w:spacing w:line="240" w:lineRule="auto" w:after="0" w:before="100"/>
               <w:ind w:left="340" w:hanging="340"/>
               <w:rPr>
                 <w:color w:val="1155cc"/>
@@ -1212,7 +1212,7 @@
           <w:p>
             <w:pPr>
               <w:widowControl w:val="1"/>
-              <w:spacing w:line="240" w:lineRule="auto" w:before="140" w:after="0"/>
+              <w:spacing w:line="240" w:lineRule="auto" w:after="0" w:before="100"/>
               <w:ind w:left="340" w:hanging="340"/>
               <w:rPr>
                 <w:color w:val="1155cc"/>
@@ -1242,7 +1242,7 @@
           <w:p>
             <w:pPr>
               <w:widowControl w:val="1"/>
-              <w:spacing w:line="240" w:lineRule="auto" w:before="140" w:after="0"/>
+              <w:spacing w:line="240" w:lineRule="auto" w:after="100" w:before="100"/>
               <w:ind w:left="340" w:hanging="340"/>
               <w:rPr>
                 <w:color w:val="1155cc"/>
@@ -1365,7 +1365,7 @@
           <w:p>
             <w:pPr>
               <w:widowControl w:val="1"/>
-              <w:spacing w:line="240" w:lineRule="auto" w:before="140" w:after="0"/>
+              <w:spacing w:line="240" w:lineRule="auto" w:after="0" w:before="100"/>
               <w:ind w:left="340" w:hanging="340"/>
               <w:rPr>
                 <w:color w:val="1155cc"/>
@@ -1395,7 +1395,7 @@
           <w:p>
             <w:pPr>
               <w:widowControl w:val="1"/>
-              <w:spacing w:line="240" w:lineRule="auto" w:before="140" w:after="0"/>
+              <w:spacing w:line="240" w:lineRule="auto" w:after="100" w:before="100"/>
               <w:ind w:left="340" w:hanging="340"/>
               <w:rPr>
                 <w:color w:val="1155cc"/>
@@ -1518,7 +1518,7 @@
           <w:p>
             <w:pPr>
               <w:widowControl w:val="1"/>
-              <w:spacing w:line="240" w:lineRule="auto" w:before="0" w:after="0"/>
+              <w:spacing w:line="240" w:lineRule="auto" w:after="0" w:before="0"/>
               <w:rPr>
                 <w:color w:val="1155cc"/>
                 <w:sz w:val="20"/>
@@ -1537,7 +1537,7 @@
           <w:p>
             <w:pPr>
               <w:widowControl w:val="1"/>
-              <w:spacing w:line="240" w:lineRule="auto" w:before="140" w:after="0"/>
+              <w:spacing w:line="240" w:lineRule="auto" w:after="0" w:before="100"/>
               <w:ind w:left="340" w:hanging="340"/>
               <w:rPr>
                 <w:color w:val="1155cc"/>
@@ -1567,7 +1567,7 @@
           <w:p>
             <w:pPr>
               <w:widowControl w:val="1"/>
-              <w:spacing w:line="240" w:lineRule="auto" w:before="140" w:after="0"/>
+              <w:spacing w:line="240" w:lineRule="auto" w:after="0" w:before="100"/>
               <w:ind w:left="340" w:hanging="340"/>
               <w:rPr>
                 <w:color w:val="1155cc"/>
@@ -1597,7 +1597,7 @@
           <w:p>
             <w:pPr>
               <w:widowControl w:val="1"/>
-              <w:spacing w:line="240" w:lineRule="auto" w:before="140" w:after="0"/>
+              <w:spacing w:line="240" w:lineRule="auto" w:after="0" w:before="100"/>
               <w:ind w:left="340" w:hanging="340"/>
               <w:rPr>
                 <w:color w:val="1155cc"/>
@@ -1627,7 +1627,7 @@
           <w:p>
             <w:pPr>
               <w:widowControl w:val="1"/>
-              <w:spacing w:line="240" w:lineRule="auto" w:before="140" w:after="0"/>
+              <w:spacing w:line="240" w:lineRule="auto" w:after="100" w:before="100"/>
               <w:ind w:left="340" w:hanging="340"/>
               <w:rPr>
                 <w:color w:val="1155cc"/>

</xml_diff>

<commit_message>
RA2-AA1: afegeix l'exercici 7 a A03 (pràctica de terminal a Ubuntu 26.04)
Nova pràctica guiada "Esborrar no és destruir": canvi del nom d'equip
(hostnamectl) per personalitzar les captures, creació d'un disc de prova
en un fitxer, demostració que rm no elimina les dades (grep), destrucció
amb shred i repàs del xifratge amb GPG (RA1). Captures reals obtingudes a
Ubuntu 26.04.1 LTS. S'afegeix una frase a la introducció de l'activitat
que anuncia la pràctica. Els exercicis 1-6 no canvien.

Co-Authored-By: Claude Opus 5.5 <noreply@anthropic.com>
Claude-Session: https://claude.ai/code/session_01BodJZ9PsepvknsFhsdyYkP
</commit_message>
<xml_diff>
--- a/RA2 - Emmagatzematge i copies de seguretat/AA1 - Protegint les dades/A03_Exercicis_Protegint_les_dades.docx
+++ b/RA2 - Emmagatzematge i copies de seguretat/AA1 - Protegint les dades/A03_Exercicis_Protegint_les_dades.docx
@@ -488,7 +488,7 @@
                 <w:szCs w:val="20"/>
                 <w:rtl w:val="0"/>
               </w:rPr>
-              <w:t xml:space="preserve">Aquesta activitat es cenyeix exclusivament a l'apartat NF2-AA1 (Protegint les dades) del RA2: continuïtat de negoci i recuperació de desastres, redundància, cicle de vida de les dades i destrucció segura de suports. Els exercicis requereixen recerca a Internet i, en un cas, l'anàlisi d'un vídeo. Respon de manera clara i justificada, citant les fonts que consultis.</w:t>
+              <w:t xml:space="preserve">Aquesta activitat es cenyeix exclusivament a l'apartat NF2-AA1 (Protegint les dades) del RA2: continuïtat de negoci i recuperació de desastres, redundància, cicle de vida de les dades i destrucció segura de suports. Els exercicis requereixen recerca a Internet i, en un cas, l'anàlisi d'un vídeo. L'exercici 7 és una pràctica guiada a Ubuntu 26.04 (terminal), en què caldrà lliurar captures de pantalla amb el nom d'equip personalitzat. Respon de manera clara i justificada, citant les fonts que consultis.</w:t>
             </w:r>
           </w:p>
         </w:tc>
@@ -1667,6 +1667,1406 @@
         </w:rPr>
       </w:r>
     </w:p>
+    <w:tbl>
+      <w:tblPr>
+        <w:tblStyle w:val="Table2"/>
+        <w:tblW w:w="9646.0" w:type="dxa"/>
+        <w:jc w:val="left"/>
+        <w:tblInd w:w="-100.0" w:type="dxa"/>
+        <w:tblBorders>
+          <w:top w:color="000000" w:space="0" w:sz="8" w:val="single"/>
+          <w:left w:color="000000" w:space="0" w:sz="8" w:val="single"/>
+          <w:bottom w:color="000000" w:space="0" w:sz="8" w:val="single"/>
+          <w:right w:color="000000" w:space="0" w:sz="8" w:val="single"/>
+          <w:insideH w:color="000000" w:space="0" w:sz="8" w:val="single"/>
+          <w:insideV w:color="000000" w:space="0" w:sz="8" w:val="single"/>
+        </w:tblBorders>
+        <w:tblLayout w:type="fixed"/>
+        <w:tblLook w:val="0600"/>
+      </w:tblPr>
+      <w:tblGrid>
+        <w:gridCol w:w="9646"/>
+        <w:tblGridChange w:id="0">
+          <w:tblGrid>
+            <w:gridCol w:w="9646"/>
+          </w:tblGrid>
+        </w:tblGridChange>
+      </w:tblGrid>
+      <w:tr>
+        <w:trPr>
+          <w:cantSplit w:val="0"/>
+          <w:trHeight w:val="324" w:hRule="atLeast"/>
+          <w:tblHeader w:val="1"/>
+        </w:trPr>
+        <w:tc>
+          <w:tcPr>
+            <w:shd w:fill="d9d9d9" w:val="clear"/>
+            <w:tcMar>
+              <w:top w:w="100.0" w:type="dxa"/>
+              <w:left w:w="100.0" w:type="dxa"/>
+              <w:bottom w:w="100.0" w:type="dxa"/>
+              <w:right w:w="100.0" w:type="dxa"/>
+            </w:tcMar>
+          </w:tcPr>
+          <w:p>
+            <w:pPr>
+              <w:pStyle w:val="Heading2"/>
+              <w:pBdr>
+                <w:bottom w:color="auto" w:space="0" w:sz="0" w:val="none"/>
+              </w:pBdr>
+              <w:spacing w:before="0" w:line="276" w:lineRule="auto"/>
+              <w:jc w:val="left"/>
+              <w:rPr>
+                <w:rFonts w:ascii="Verdana" w:cs="Verdana" w:eastAsia="Verdana" w:hAnsi="Verdana"/>
+              </w:rPr>
+            </w:pPr>
+            <w:bookmarkStart w:colFirst="0" w:colLast="0" w:name="_30j0zll" w:id="1"/>
+            <w:bookmarkEnd w:id="1"/>
+            <w:r>
+              <w:rPr>
+                <w:rFonts w:ascii="Verdana" w:cs="Verdana" w:eastAsia="Verdana" w:hAnsi="Verdana"/>
+                <w:rtl w:val="0"/>
+              </w:rPr>
+              <w:t xml:space="preserve">Enunciat exercici 7</w:t>
+            </w:r>
+          </w:p>
+        </w:tc>
+      </w:tr>
+      <w:tr>
+        <w:trPr>
+          <w:cantSplit w:val="0"/>
+          <w:tblHeader w:val="0"/>
+        </w:trPr>
+        <w:tc>
+          <w:tcPr>
+            <w:shd w:fill="auto" w:val="clear"/>
+            <w:tcMar>
+              <w:top w:w="100.0" w:type="dxa"/>
+              <w:left w:w="100.0" w:type="dxa"/>
+              <w:bottom w:w="100.0" w:type="dxa"/>
+              <w:right w:w="100.0" w:type="dxa"/>
+            </w:tcMar>
+          </w:tcPr>
+          <w:p>
+            <w:pPr>
+              <w:widowControl w:val="1"/>
+              <w:spacing w:line="240" w:lineRule="auto" w:after="100"/>
+              <w:rPr>
+                <w:color w:val="1155cc"/>
+                <w:sz w:val="20"/>
+                <w:szCs w:val="20"/>
+              </w:rPr>
+            </w:pPr>
+            <w:r>
+              <w:rPr>
+                <w:sz w:val="20"/>
+                <w:szCs w:val="20"/>
+                <w:rtl w:val="0"/>
+              </w:rPr>
+              <w:t xml:space="preserve">Pràctica guiada a Ubuntu 26.04 (terminal): esborrar no és destruir. Comprovaràs que esborrar un fitxer no n'elimina les dades del disc, i que només la sobrescriptura les destrueix de debò. Treballaràs sobre un disc virtual creat dins d'un fitxer, de manera que no hi ha cap risc per al sistema. Es recomana fer tota la pràctica des d'una màquina virtual d'Ubuntu 26.04 a IsardVDI, per disposar dels permisos de sudo necessaris. Lliura una captura de cada pas assenyalat amb [CAPTURA].</w:t>
+            </w:r>
+          </w:p>
+          <w:p>
+            <w:pPr>
+              <w:widowControl w:val="1"/>
+              <w:spacing w:line="240" w:lineRule="auto" w:after="100"/>
+              <w:rPr>
+                <w:color w:val="1155cc"/>
+                <w:sz w:val="20"/>
+                <w:szCs w:val="20"/>
+              </w:rPr>
+            </w:pPr>
+            <w:r>
+              <w:rPr>
+                <w:bCs/>
+                <w:b/>
+                <w:sz w:val="20"/>
+                <w:szCs w:val="20"/>
+                <w:rtl w:val="0"/>
+              </w:rPr>
+              <w:t xml:space="preserve">Pas 0. </w:t>
+            </w:r>
+            <w:r>
+              <w:rPr>
+                <w:sz w:val="20"/>
+                <w:szCs w:val="20"/>
+                <w:rtl w:val="0"/>
+              </w:rPr>
+              <w:t xml:space="preserve">Personalitza el nom de l'equip perquè les captures siguin teves: canvia'l per pc-nomcognom, substituint nomcognom pel teu nom i primer cognom, en minúscules i sense espais ni accents (per exemple, pc-martapuig). Després tanca el terminal i obre'n un de nou: el nom nou ha d'aparèixer a l'indicador (alumne@pc-nomcognom). Totes les captures de la pràctica han de mostrar aquest nom. [CAPTURA]</w:t>
+            </w:r>
+          </w:p>
+          <w:p>
+            <w:pPr>
+              <w:pBdr>
+                <w:top w:val="single" w:color="CADCE8" w:sz="4"/>
+                <w:bottom w:val="single" w:color="CADCE8" w:sz="4"/>
+                <w:left w:val="single" w:color="CADCE8" w:sz="4"/>
+                <w:right w:val="single" w:color="CADCE8" w:sz="4"/>
+              </w:pBdr>
+              <w:shd w:fill="F4F7F9" w:val="clear"/>
+              <w:spacing w:after="160" w:before="80"/>
+              <w:jc w:val="left"/>
+            </w:pPr>
+            <w:r>
+              <w:rPr>
+                <w:rFonts w:ascii="Consolas" w:cs="Consolas" w:eastAsia="Consolas" w:hAnsi="Consolas"/>
+                <w:sz w:val="19"/>
+                <w:szCs w:val="19"/>
+              </w:rPr>
+              <w:t xml:space="preserve">hostname</w:t>
+            </w:r>
+            <w:r>
+              <w:br/>
+              <w:t xml:space="preserve"/>
+            </w:r>
+            <w:r>
+              <w:rPr>
+                <w:rFonts w:ascii="Consolas" w:cs="Consolas" w:eastAsia="Consolas" w:hAnsi="Consolas"/>
+                <w:sz w:val="19"/>
+                <w:szCs w:val="19"/>
+              </w:rPr>
+              <w:t xml:space="preserve">sudo hostnamectl set-hostname pc-nomcognom</w:t>
+            </w:r>
+            <w:r>
+              <w:br/>
+              <w:t xml:space="preserve"/>
+            </w:r>
+            <w:r>
+              <w:rPr>
+                <w:rFonts w:ascii="Consolas" w:cs="Consolas" w:eastAsia="Consolas" w:hAnsi="Consolas"/>
+                <w:sz w:val="19"/>
+                <w:szCs w:val="19"/>
+              </w:rPr>
+              <w:t xml:space="preserve"># Tanca el terminal i obre'n un de nou</w:t>
+            </w:r>
+            <w:r>
+              <w:br/>
+              <w:t xml:space="preserve"/>
+            </w:r>
+            <w:r>
+              <w:rPr>
+                <w:rFonts w:ascii="Consolas" w:cs="Consolas" w:eastAsia="Consolas" w:hAnsi="Consolas"/>
+                <w:sz w:val="19"/>
+                <w:szCs w:val="19"/>
+              </w:rPr>
+              <w:t xml:space="preserve">hostname</w:t>
+            </w:r>
+          </w:p>
+          <w:p>
+            <w:pPr>
+              <w:widowControl w:val="1"/>
+              <w:spacing w:line="240" w:lineRule="auto" w:after="100"/>
+              <w:rPr>
+                <w:color w:val="1155cc"/>
+                <w:sz w:val="20"/>
+                <w:szCs w:val="20"/>
+              </w:rPr>
+            </w:pPr>
+            <w:r>
+              <w:rPr>
+                <w:sz w:val="20"/>
+                <w:szCs w:val="20"/>
+                <w:rtl w:val="0"/>
+              </w:rPr>
+              <w:drawing>
+                <wp:inline distT="0" distB="0" distL="0" distR="0">
+                  <wp:extent cx="4382346" cy="1449493"/>
+                  <wp:effectExtent t="0" r="0" b="0" l="0"/>
+                  <wp:docPr id="1" name="" descr="" title=""/>
+                  <wp:cNvGraphicFramePr>
+                    <a:graphicFrameLocks noChangeAspect="1"/>
+                  </wp:cNvGraphicFramePr>
+                  <a:graphic>
+                    <a:graphicData uri="http://schemas.openxmlformats.org/drawingml/2006/picture">
+                      <pic:pic>
+                        <pic:nvPicPr>
+                          <pic:cNvPr id="0" name="" descr=""/>
+                          <pic:cNvPicPr>
+                            <a:picLocks noChangeAspect="1" noChangeArrowheads="1"/>
+                          </pic:cNvPicPr>
+                        </pic:nvPicPr>
+                        <pic:blipFill>
+                          <a:blip r:embed="rId2" cstate="none"/>
+                          <a:srcRect/>
+                          <a:stretch>
+                            <a:fillRect/>
+                          </a:stretch>
+                        </pic:blipFill>
+                        <pic:spPr bwMode="auto">
+                          <a:xfrm>
+                            <a:off x="0" y="0"/>
+                            <a:ext cx="4382346" cy="1449493"/>
+                          </a:xfrm>
+                          <a:prstGeom prst="rect">
+                            <a:avLst/>
+                          </a:prstGeom>
+                        </pic:spPr>
+                      </pic:pic>
+                    </a:graphicData>
+                  </a:graphic>
+                </wp:inline>
+              </w:drawing>
+            </w:r>
+          </w:p>
+          <w:p>
+            <w:pPr>
+              <w:widowControl w:val="1"/>
+              <w:spacing w:line="240" w:lineRule="auto" w:after="100"/>
+              <w:rPr>
+                <w:color w:val="1155cc"/>
+                <w:sz w:val="20"/>
+                <w:szCs w:val="20"/>
+              </w:rPr>
+            </w:pPr>
+            <w:r>
+              <w:rPr>
+                <w:sz w:val="20"/>
+                <w:szCs w:val="20"/>
+                <w:rtl w:val="0"/>
+              </w:rPr>
+              <w:drawing>
+                <wp:inline distT="0" distB="0" distL="0" distR="0">
+                  <wp:extent cx="4199466" cy="921173"/>
+                  <wp:effectExtent t="0" r="0" b="0" l="0"/>
+                  <wp:docPr id="1" name="" descr="" title=""/>
+                  <wp:cNvGraphicFramePr>
+                    <a:graphicFrameLocks noChangeAspect="1"/>
+                  </wp:cNvGraphicFramePr>
+                  <a:graphic>
+                    <a:graphicData uri="http://schemas.openxmlformats.org/drawingml/2006/picture">
+                      <pic:pic>
+                        <pic:nvPicPr>
+                          <pic:cNvPr id="0" name="" descr=""/>
+                          <pic:cNvPicPr>
+                            <a:picLocks noChangeAspect="1" noChangeArrowheads="1"/>
+                          </pic:cNvPicPr>
+                        </pic:nvPicPr>
+                        <pic:blipFill>
+                          <a:blip r:embed="rId9" cstate="none"/>
+                          <a:srcRect/>
+                          <a:stretch>
+                            <a:fillRect/>
+                          </a:stretch>
+                        </pic:blipFill>
+                        <pic:spPr bwMode="auto">
+                          <a:xfrm>
+                            <a:off x="0" y="0"/>
+                            <a:ext cx="4199466" cy="921173"/>
+                          </a:xfrm>
+                          <a:prstGeom prst="rect">
+                            <a:avLst/>
+                          </a:prstGeom>
+                        </pic:spPr>
+                      </pic:pic>
+                    </a:graphicData>
+                  </a:graphic>
+                </wp:inline>
+              </w:drawing>
+            </w:r>
+          </w:p>
+          <w:p>
+            <w:pPr>
+              <w:widowControl w:val="1"/>
+              <w:spacing w:line="240" w:lineRule="auto" w:after="100"/>
+              <w:rPr>
+                <w:color w:val="1155cc"/>
+                <w:sz w:val="20"/>
+                <w:szCs w:val="20"/>
+              </w:rPr>
+            </w:pPr>
+            <w:r>
+              <w:rPr>
+                <w:color w:val="5B6B77"/>
+                <w:iCs/>
+                <w:i/>
+                <w:sz w:val="20"/>
+                <w:szCs w:val="20"/>
+                <w:rtl w:val="0"/>
+              </w:rPr>
+              <w:t xml:space="preserve">Captura real (Ubuntu 26.04): canvi del nom de l'equip amb hostnamectl. L'indicador només canvia en obrir un terminal nou.</w:t>
+            </w:r>
+          </w:p>
+          <w:p>
+            <w:pPr>
+              <w:widowControl w:val="1"/>
+              <w:spacing w:line="240" w:lineRule="auto" w:after="100"/>
+              <w:rPr>
+                <w:color w:val="1155cc"/>
+                <w:sz w:val="20"/>
+                <w:szCs w:val="20"/>
+              </w:rPr>
+            </w:pPr>
+            <w:r>
+              <w:rPr>
+                <w:bCs/>
+                <w:b/>
+                <w:sz w:val="20"/>
+                <w:szCs w:val="20"/>
+                <w:rtl w:val="0"/>
+              </w:rPr>
+              <w:t xml:space="preserve">Pas 1. </w:t>
+            </w:r>
+            <w:r>
+              <w:rPr>
+                <w:sz w:val="20"/>
+                <w:szCs w:val="20"/>
+                <w:rtl w:val="0"/>
+              </w:rPr>
+              <w:t xml:space="preserve">Crea una carpeta de treball i un "disc" de prova de 20 MB dins d'un fitxer. Formata'l amb ext4 i munta'l a /mnt/prova. [CAPTURA]</w:t>
+            </w:r>
+          </w:p>
+          <w:p>
+            <w:pPr>
+              <w:pBdr>
+                <w:top w:val="single" w:color="CADCE8" w:sz="4"/>
+                <w:bottom w:val="single" w:color="CADCE8" w:sz="4"/>
+                <w:left w:val="single" w:color="CADCE8" w:sz="4"/>
+                <w:right w:val="single" w:color="CADCE8" w:sz="4"/>
+              </w:pBdr>
+              <w:shd w:fill="F4F7F9" w:val="clear"/>
+              <w:spacing w:after="160" w:before="80"/>
+              <w:jc w:val="left"/>
+            </w:pPr>
+            <w:r>
+              <w:rPr>
+                <w:rFonts w:ascii="Consolas" w:cs="Consolas" w:eastAsia="Consolas" w:hAnsi="Consolas"/>
+                <w:sz w:val="19"/>
+                <w:szCs w:val="19"/>
+              </w:rPr>
+              <w:t xml:space="preserve">mkdir -p ~/practica &amp;&amp; cd ~/practica</w:t>
+            </w:r>
+            <w:r>
+              <w:br/>
+              <w:t xml:space="preserve"/>
+            </w:r>
+            <w:r>
+              <w:rPr>
+                <w:rFonts w:ascii="Consolas" w:cs="Consolas" w:eastAsia="Consolas" w:hAnsi="Consolas"/>
+                <w:sz w:val="19"/>
+                <w:szCs w:val="19"/>
+              </w:rPr>
+              <w:t xml:space="preserve">truncate -s 20M disc.img</w:t>
+            </w:r>
+            <w:r>
+              <w:br/>
+              <w:t xml:space="preserve"/>
+            </w:r>
+            <w:r>
+              <w:rPr>
+                <w:rFonts w:ascii="Consolas" w:cs="Consolas" w:eastAsia="Consolas" w:hAnsi="Consolas"/>
+                <w:sz w:val="19"/>
+                <w:szCs w:val="19"/>
+              </w:rPr>
+              <w:t xml:space="preserve">ls -lh disc.img</w:t>
+            </w:r>
+            <w:r>
+              <w:br/>
+              <w:t xml:space="preserve"/>
+            </w:r>
+            <w:r>
+              <w:rPr>
+                <w:rFonts w:ascii="Consolas" w:cs="Consolas" w:eastAsia="Consolas" w:hAnsi="Consolas"/>
+                <w:sz w:val="19"/>
+                <w:szCs w:val="19"/>
+              </w:rPr>
+              <w:t xml:space="preserve">mkfs.ext4 disc.img</w:t>
+            </w:r>
+            <w:r>
+              <w:br/>
+              <w:t xml:space="preserve"/>
+            </w:r>
+            <w:r>
+              <w:rPr>
+                <w:rFonts w:ascii="Consolas" w:cs="Consolas" w:eastAsia="Consolas" w:hAnsi="Consolas"/>
+                <w:sz w:val="19"/>
+                <w:szCs w:val="19"/>
+              </w:rPr>
+              <w:t xml:space="preserve">sudo mkdir -p /mnt/prova</w:t>
+            </w:r>
+            <w:r>
+              <w:br/>
+              <w:t xml:space="preserve"/>
+            </w:r>
+            <w:r>
+              <w:rPr>
+                <w:rFonts w:ascii="Consolas" w:cs="Consolas" w:eastAsia="Consolas" w:hAnsi="Consolas"/>
+                <w:sz w:val="19"/>
+                <w:szCs w:val="19"/>
+              </w:rPr>
+              <w:t xml:space="preserve">sudo mount -o loop disc.img /mnt/prova</w:t>
+            </w:r>
+            <w:r>
+              <w:br/>
+              <w:t xml:space="preserve"/>
+            </w:r>
+            <w:r>
+              <w:rPr>
+                <w:rFonts w:ascii="Consolas" w:cs="Consolas" w:eastAsia="Consolas" w:hAnsi="Consolas"/>
+                <w:sz w:val="19"/>
+                <w:szCs w:val="19"/>
+              </w:rPr>
+              <w:t xml:space="preserve">df -h /mnt/prova</w:t>
+            </w:r>
+          </w:p>
+          <w:p>
+            <w:pPr>
+              <w:widowControl w:val="1"/>
+              <w:spacing w:line="240" w:lineRule="auto" w:after="100"/>
+              <w:rPr>
+                <w:color w:val="1155cc"/>
+                <w:sz w:val="20"/>
+                <w:szCs w:val="20"/>
+              </w:rPr>
+            </w:pPr>
+            <w:r>
+              <w:rPr>
+                <w:sz w:val="20"/>
+                <w:szCs w:val="20"/>
+                <w:rtl w:val="0"/>
+              </w:rPr>
+              <w:drawing>
+                <wp:inline distT="0" distB="0" distL="0" distR="0">
+                  <wp:extent cx="5147733" cy="4443306"/>
+                  <wp:effectExtent t="0" r="0" b="0" l="0"/>
+                  <wp:docPr id="1" name="" descr="" title=""/>
+                  <wp:cNvGraphicFramePr>
+                    <a:graphicFrameLocks noChangeAspect="1"/>
+                  </wp:cNvGraphicFramePr>
+                  <a:graphic>
+                    <a:graphicData uri="http://schemas.openxmlformats.org/drawingml/2006/picture">
+                      <pic:pic>
+                        <pic:nvPicPr>
+                          <pic:cNvPr id="0" name="" descr=""/>
+                          <pic:cNvPicPr>
+                            <a:picLocks noChangeAspect="1" noChangeArrowheads="1"/>
+                          </pic:cNvPicPr>
+                        </pic:nvPicPr>
+                        <pic:blipFill>
+                          <a:blip r:embed="rId10" cstate="none"/>
+                          <a:srcRect/>
+                          <a:stretch>
+                            <a:fillRect/>
+                          </a:stretch>
+                        </pic:blipFill>
+                        <pic:spPr bwMode="auto">
+                          <a:xfrm>
+                            <a:off x="0" y="0"/>
+                            <a:ext cx="5147733" cy="4443306"/>
+                          </a:xfrm>
+                          <a:prstGeom prst="rect">
+                            <a:avLst/>
+                          </a:prstGeom>
+                        </pic:spPr>
+                      </pic:pic>
+                    </a:graphicData>
+                  </a:graphic>
+                </wp:inline>
+              </w:drawing>
+            </w:r>
+          </w:p>
+          <w:p>
+            <w:pPr>
+              <w:widowControl w:val="1"/>
+              <w:spacing w:line="240" w:lineRule="auto" w:after="100"/>
+              <w:rPr>
+                <w:color w:val="1155cc"/>
+                <w:sz w:val="20"/>
+                <w:szCs w:val="20"/>
+              </w:rPr>
+            </w:pPr>
+            <w:r>
+              <w:rPr>
+                <w:color w:val="5B6B77"/>
+                <w:iCs/>
+                <w:i/>
+                <w:sz w:val="20"/>
+                <w:szCs w:val="20"/>
+                <w:rtl w:val="0"/>
+              </w:rPr>
+              <w:t xml:space="preserve">Captura real: creació del disc de prova de 20 MB, format ext4 i muntatge a /mnt/prova.</w:t>
+            </w:r>
+          </w:p>
+          <w:p>
+            <w:pPr>
+              <w:widowControl w:val="1"/>
+              <w:spacing w:line="240" w:lineRule="auto" w:after="100"/>
+              <w:rPr>
+                <w:color w:val="1155cc"/>
+                <w:sz w:val="20"/>
+                <w:szCs w:val="20"/>
+              </w:rPr>
+            </w:pPr>
+            <w:r>
+              <w:rPr>
+                <w:bCs/>
+                <w:b/>
+                <w:sz w:val="20"/>
+                <w:szCs w:val="20"/>
+                <w:rtl w:val="0"/>
+              </w:rPr>
+              <w:t xml:space="preserve">Pas 2. </w:t>
+            </w:r>
+            <w:r>
+              <w:rPr>
+                <w:sz w:val="20"/>
+                <w:szCs w:val="20"/>
+                <w:rtl w:val="0"/>
+              </w:rPr>
+              <w:t xml:space="preserve">Desa-hi un fitxer amb dades personals inventades, comprova que hi és i desmunta el disc. Després, busca el text directament dins del fitxer disc.img (l'opció -a fa que grep tracti el disc com si fos text). [CAPTURA]</w:t>
+            </w:r>
+          </w:p>
+          <w:p>
+            <w:pPr>
+              <w:pBdr>
+                <w:top w:val="single" w:color="CADCE8" w:sz="4"/>
+                <w:bottom w:val="single" w:color="CADCE8" w:sz="4"/>
+                <w:left w:val="single" w:color="CADCE8" w:sz="4"/>
+                <w:right w:val="single" w:color="CADCE8" w:sz="4"/>
+              </w:pBdr>
+              <w:shd w:fill="F4F7F9" w:val="clear"/>
+              <w:spacing w:after="160" w:before="80"/>
+              <w:jc w:val="left"/>
+            </w:pPr>
+            <w:r>
+              <w:rPr>
+                <w:rFonts w:ascii="Consolas" w:cs="Consolas" w:eastAsia="Consolas" w:hAnsi="Consolas"/>
+                <w:sz w:val="19"/>
+                <w:szCs w:val="19"/>
+              </w:rPr>
+              <w:t xml:space="preserve">echo "Alumne: Marta Puig - DNI 12345678Z - Nota final: 9,5 - CONFIDENCIAL" | sudo tee /mnt/prova/notes.txt</w:t>
+            </w:r>
+            <w:r>
+              <w:br/>
+              <w:t xml:space="preserve"/>
+            </w:r>
+            <w:r>
+              <w:rPr>
+                <w:rFonts w:ascii="Consolas" w:cs="Consolas" w:eastAsia="Consolas" w:hAnsi="Consolas"/>
+                <w:sz w:val="19"/>
+                <w:szCs w:val="19"/>
+              </w:rPr>
+              <w:t xml:space="preserve">ls -l /mnt/prova</w:t>
+            </w:r>
+            <w:r>
+              <w:br/>
+              <w:t xml:space="preserve"/>
+            </w:r>
+            <w:r>
+              <w:rPr>
+                <w:rFonts w:ascii="Consolas" w:cs="Consolas" w:eastAsia="Consolas" w:hAnsi="Consolas"/>
+                <w:sz w:val="19"/>
+                <w:szCs w:val="19"/>
+              </w:rPr>
+              <w:t xml:space="preserve">sudo umount /mnt/prova</w:t>
+            </w:r>
+            <w:r>
+              <w:br/>
+              <w:t xml:space="preserve"/>
+            </w:r>
+            <w:r>
+              <w:rPr>
+                <w:rFonts w:ascii="Consolas" w:cs="Consolas" w:eastAsia="Consolas" w:hAnsi="Consolas"/>
+                <w:sz w:val="19"/>
+                <w:szCs w:val="19"/>
+              </w:rPr>
+              <w:t xml:space="preserve">grep -a -o "Alumne.*CONFIDENCIAL" disc.img</w:t>
+            </w:r>
+          </w:p>
+          <w:p>
+            <w:pPr>
+              <w:widowControl w:val="1"/>
+              <w:spacing w:line="240" w:lineRule="auto" w:after="100"/>
+              <w:rPr>
+                <w:color w:val="1155cc"/>
+                <w:sz w:val="20"/>
+                <w:szCs w:val="20"/>
+              </w:rPr>
+            </w:pPr>
+            <w:r>
+              <w:rPr>
+                <w:sz w:val="20"/>
+                <w:szCs w:val="20"/>
+                <w:rtl w:val="0"/>
+              </w:rPr>
+              <w:drawing>
+                <wp:inline distT="0" distB="0" distL="0" distR="0">
+                  <wp:extent cx="5669280" cy="2775447"/>
+                  <wp:effectExtent t="0" r="0" b="0" l="0"/>
+                  <wp:docPr id="1" name="" descr="" title=""/>
+                  <wp:cNvGraphicFramePr>
+                    <a:graphicFrameLocks noChangeAspect="1"/>
+                  </wp:cNvGraphicFramePr>
+                  <a:graphic>
+                    <a:graphicData uri="http://schemas.openxmlformats.org/drawingml/2006/picture">
+                      <pic:pic>
+                        <pic:nvPicPr>
+                          <pic:cNvPr id="0" name="" descr=""/>
+                          <pic:cNvPicPr>
+                            <a:picLocks noChangeAspect="1" noChangeArrowheads="1"/>
+                          </pic:cNvPicPr>
+                        </pic:nvPicPr>
+                        <pic:blipFill>
+                          <a:blip r:embed="rId11" cstate="none"/>
+                          <a:srcRect/>
+                          <a:stretch>
+                            <a:fillRect/>
+                          </a:stretch>
+                        </pic:blipFill>
+                        <pic:spPr bwMode="auto">
+                          <a:xfrm>
+                            <a:off x="0" y="0"/>
+                            <a:ext cx="5669280" cy="2775447"/>
+                          </a:xfrm>
+                          <a:prstGeom prst="rect">
+                            <a:avLst/>
+                          </a:prstGeom>
+                        </pic:spPr>
+                      </pic:pic>
+                    </a:graphicData>
+                  </a:graphic>
+                </wp:inline>
+              </w:drawing>
+            </w:r>
+          </w:p>
+          <w:p>
+            <w:pPr>
+              <w:widowControl w:val="1"/>
+              <w:spacing w:line="240" w:lineRule="auto" w:after="100"/>
+              <w:rPr>
+                <w:color w:val="1155cc"/>
+                <w:sz w:val="20"/>
+                <w:szCs w:val="20"/>
+              </w:rPr>
+            </w:pPr>
+            <w:r>
+              <w:rPr>
+                <w:color w:val="5B6B77"/>
+                <w:iCs/>
+                <w:i/>
+                <w:sz w:val="20"/>
+                <w:szCs w:val="20"/>
+                <w:rtl w:val="0"/>
+              </w:rPr>
+              <w:t xml:space="preserve">Captura real: el fitxer notes.txt es desa al disc i grep en troba el contingut dins de disc.img.</w:t>
+            </w:r>
+          </w:p>
+          <w:p>
+            <w:pPr>
+              <w:widowControl w:val="1"/>
+              <w:spacing w:line="240" w:lineRule="auto" w:after="100"/>
+              <w:rPr>
+                <w:color w:val="1155cc"/>
+                <w:sz w:val="20"/>
+                <w:szCs w:val="20"/>
+              </w:rPr>
+            </w:pPr>
+            <w:r>
+              <w:rPr>
+                <w:bCs/>
+                <w:b/>
+                <w:sz w:val="20"/>
+                <w:szCs w:val="20"/>
+                <w:rtl w:val="0"/>
+              </w:rPr>
+              <w:t xml:space="preserve">Pas 3. </w:t>
+            </w:r>
+            <w:r>
+              <w:rPr>
+                <w:sz w:val="20"/>
+                <w:szCs w:val="20"/>
+                <w:rtl w:val="0"/>
+              </w:rPr>
+              <w:t xml:space="preserve">Torna a muntar el disc, esborra el fitxer amb rm i comprova que ja no apareix. Desmunta el disc i torna a buscar el text dins de disc.img. [CAPTURA]</w:t>
+            </w:r>
+          </w:p>
+          <w:p>
+            <w:pPr>
+              <w:pBdr>
+                <w:top w:val="single" w:color="CADCE8" w:sz="4"/>
+                <w:bottom w:val="single" w:color="CADCE8" w:sz="4"/>
+                <w:left w:val="single" w:color="CADCE8" w:sz="4"/>
+                <w:right w:val="single" w:color="CADCE8" w:sz="4"/>
+              </w:pBdr>
+              <w:shd w:fill="F4F7F9" w:val="clear"/>
+              <w:spacing w:after="160" w:before="80"/>
+              <w:jc w:val="left"/>
+            </w:pPr>
+            <w:r>
+              <w:rPr>
+                <w:rFonts w:ascii="Consolas" w:cs="Consolas" w:eastAsia="Consolas" w:hAnsi="Consolas"/>
+                <w:sz w:val="19"/>
+                <w:szCs w:val="19"/>
+              </w:rPr>
+              <w:t xml:space="preserve">sudo mount -o loop disc.img /mnt/prova</w:t>
+            </w:r>
+            <w:r>
+              <w:br/>
+              <w:t xml:space="preserve"/>
+            </w:r>
+            <w:r>
+              <w:rPr>
+                <w:rFonts w:ascii="Consolas" w:cs="Consolas" w:eastAsia="Consolas" w:hAnsi="Consolas"/>
+                <w:sz w:val="19"/>
+                <w:szCs w:val="19"/>
+              </w:rPr>
+              <w:t xml:space="preserve">sudo rm /mnt/prova/notes.txt</w:t>
+            </w:r>
+            <w:r>
+              <w:br/>
+              <w:t xml:space="preserve"/>
+            </w:r>
+            <w:r>
+              <w:rPr>
+                <w:rFonts w:ascii="Consolas" w:cs="Consolas" w:eastAsia="Consolas" w:hAnsi="Consolas"/>
+                <w:sz w:val="19"/>
+                <w:szCs w:val="19"/>
+              </w:rPr>
+              <w:t xml:space="preserve">ls -l /mnt/prova</w:t>
+            </w:r>
+            <w:r>
+              <w:br/>
+              <w:t xml:space="preserve"/>
+            </w:r>
+            <w:r>
+              <w:rPr>
+                <w:rFonts w:ascii="Consolas" w:cs="Consolas" w:eastAsia="Consolas" w:hAnsi="Consolas"/>
+                <w:sz w:val="19"/>
+                <w:szCs w:val="19"/>
+              </w:rPr>
+              <w:t xml:space="preserve">sudo umount /mnt/prova</w:t>
+            </w:r>
+            <w:r>
+              <w:br/>
+              <w:t xml:space="preserve"/>
+            </w:r>
+            <w:r>
+              <w:rPr>
+                <w:rFonts w:ascii="Consolas" w:cs="Consolas" w:eastAsia="Consolas" w:hAnsi="Consolas"/>
+                <w:sz w:val="19"/>
+                <w:szCs w:val="19"/>
+              </w:rPr>
+              <w:t xml:space="preserve">grep -a -o "Alumne.*CONFIDENCIAL" disc.img</w:t>
+            </w:r>
+          </w:p>
+          <w:p>
+            <w:pPr>
+              <w:widowControl w:val="1"/>
+              <w:spacing w:line="240" w:lineRule="auto" w:after="100"/>
+              <w:rPr>
+                <w:color w:val="1155cc"/>
+                <w:sz w:val="20"/>
+                <w:szCs w:val="20"/>
+              </w:rPr>
+            </w:pPr>
+            <w:r>
+              <w:rPr>
+                <w:sz w:val="20"/>
+                <w:szCs w:val="20"/>
+                <w:rtl w:val="0"/>
+              </w:rPr>
+              <w:drawing>
+                <wp:inline distT="0" distB="0" distL="0" distR="0">
+                  <wp:extent cx="5425440" cy="2682240"/>
+                  <wp:effectExtent t="0" r="0" b="0" l="0"/>
+                  <wp:docPr id="1" name="" descr="" title=""/>
+                  <wp:cNvGraphicFramePr>
+                    <a:graphicFrameLocks noChangeAspect="1"/>
+                  </wp:cNvGraphicFramePr>
+                  <a:graphic>
+                    <a:graphicData uri="http://schemas.openxmlformats.org/drawingml/2006/picture">
+                      <pic:pic>
+                        <pic:nvPicPr>
+                          <pic:cNvPr id="0" name="" descr=""/>
+                          <pic:cNvPicPr>
+                            <a:picLocks noChangeAspect="1" noChangeArrowheads="1"/>
+                          </pic:cNvPicPr>
+                        </pic:nvPicPr>
+                        <pic:blipFill>
+                          <a:blip r:embed="rId12" cstate="none"/>
+                          <a:srcRect/>
+                          <a:stretch>
+                            <a:fillRect/>
+                          </a:stretch>
+                        </pic:blipFill>
+                        <pic:spPr bwMode="auto">
+                          <a:xfrm>
+                            <a:off x="0" y="0"/>
+                            <a:ext cx="5425440" cy="2682240"/>
+                          </a:xfrm>
+                          <a:prstGeom prst="rect">
+                            <a:avLst/>
+                          </a:prstGeom>
+                        </pic:spPr>
+                      </pic:pic>
+                    </a:graphicData>
+                  </a:graphic>
+                </wp:inline>
+              </w:drawing>
+            </w:r>
+          </w:p>
+          <w:p>
+            <w:pPr>
+              <w:widowControl w:val="1"/>
+              <w:spacing w:line="240" w:lineRule="auto" w:after="100"/>
+              <w:rPr>
+                <w:color w:val="1155cc"/>
+                <w:sz w:val="20"/>
+                <w:szCs w:val="20"/>
+              </w:rPr>
+            </w:pPr>
+            <w:r>
+              <w:rPr>
+                <w:color w:val="5B6B77"/>
+                <w:iCs/>
+                <w:i/>
+                <w:sz w:val="20"/>
+                <w:szCs w:val="20"/>
+                <w:rtl w:val="0"/>
+              </w:rPr>
+              <w:t xml:space="preserve">Captura real: després de rm, ls ja no mostra notes.txt, però grep continua trobant les dades de la Marta dins del disc.</w:t>
+            </w:r>
+          </w:p>
+          <w:p>
+            <w:pPr>
+              <w:widowControl w:val="1"/>
+              <w:spacing w:line="240" w:lineRule="auto" w:after="100"/>
+              <w:rPr>
+                <w:color w:val="1155cc"/>
+                <w:sz w:val="20"/>
+                <w:szCs w:val="20"/>
+              </w:rPr>
+            </w:pPr>
+            <w:r>
+              <w:rPr>
+                <w:sz w:val="20"/>
+                <w:szCs w:val="20"/>
+                <w:rtl w:val="0"/>
+              </w:rPr>
+              <w:t xml:space="preserve">Pregunta de reflexió: per què grep encara troba les dades si el fitxer "ja no existeix"?</w:t>
+            </w:r>
+          </w:p>
+          <w:p>
+            <w:pPr>
+              <w:widowControl w:val="1"/>
+              <w:spacing w:line="240" w:lineRule="auto" w:after="100"/>
+              <w:rPr>
+                <w:color w:val="1155cc"/>
+                <w:sz w:val="20"/>
+                <w:szCs w:val="20"/>
+              </w:rPr>
+            </w:pPr>
+            <w:r>
+              <w:rPr>
+                <w:bCs/>
+                <w:b/>
+                <w:sz w:val="20"/>
+                <w:szCs w:val="20"/>
+                <w:rtl w:val="0"/>
+              </w:rPr>
+              <w:t xml:space="preserve">Pas 4. </w:t>
+            </w:r>
+            <w:r>
+              <w:rPr>
+                <w:sz w:val="20"/>
+                <w:szCs w:val="20"/>
+                <w:rtl w:val="0"/>
+              </w:rPr>
+              <w:t xml:space="preserve">Sobreescriu tot el disc amb shred: l'opció -n 3 fa tres passades amb dades aleatòries i l'opció -z n'hi afegeix una última amb zeros. Torna a buscar el text i intenta muntar el disc de nou. [CAPTURA]</w:t>
+            </w:r>
+          </w:p>
+          <w:p>
+            <w:pPr>
+              <w:pBdr>
+                <w:top w:val="single" w:color="CADCE8" w:sz="4"/>
+                <w:bottom w:val="single" w:color="CADCE8" w:sz="4"/>
+                <w:left w:val="single" w:color="CADCE8" w:sz="4"/>
+                <w:right w:val="single" w:color="CADCE8" w:sz="4"/>
+              </w:pBdr>
+              <w:shd w:fill="F4F7F9" w:val="clear"/>
+              <w:spacing w:after="160" w:before="80"/>
+              <w:jc w:val="left"/>
+            </w:pPr>
+            <w:r>
+              <w:rPr>
+                <w:rFonts w:ascii="Consolas" w:cs="Consolas" w:eastAsia="Consolas" w:hAnsi="Consolas"/>
+                <w:sz w:val="19"/>
+                <w:szCs w:val="19"/>
+              </w:rPr>
+              <w:t xml:space="preserve">shred -v -n 3 -z disc.img</w:t>
+            </w:r>
+            <w:r>
+              <w:br/>
+              <w:t xml:space="preserve"/>
+            </w:r>
+            <w:r>
+              <w:rPr>
+                <w:rFonts w:ascii="Consolas" w:cs="Consolas" w:eastAsia="Consolas" w:hAnsi="Consolas"/>
+                <w:sz w:val="19"/>
+                <w:szCs w:val="19"/>
+              </w:rPr>
+              <w:t xml:space="preserve">grep -a -c "CONFIDENCIAL" disc.img</w:t>
+            </w:r>
+            <w:r>
+              <w:br/>
+              <w:t xml:space="preserve"/>
+            </w:r>
+            <w:r>
+              <w:rPr>
+                <w:rFonts w:ascii="Consolas" w:cs="Consolas" w:eastAsia="Consolas" w:hAnsi="Consolas"/>
+                <w:sz w:val="19"/>
+                <w:szCs w:val="19"/>
+              </w:rPr>
+              <w:t xml:space="preserve">sudo mount -o loop disc.img /mnt/prova</w:t>
+            </w:r>
+          </w:p>
+          <w:p>
+            <w:pPr>
+              <w:widowControl w:val="1"/>
+              <w:spacing w:line="240" w:lineRule="auto" w:after="100"/>
+              <w:rPr>
+                <w:color w:val="1155cc"/>
+                <w:sz w:val="20"/>
+                <w:szCs w:val="20"/>
+              </w:rPr>
+            </w:pPr>
+            <w:r>
+              <w:rPr>
+                <w:sz w:val="20"/>
+                <w:szCs w:val="20"/>
+                <w:rtl w:val="0"/>
+              </w:rPr>
+              <w:drawing>
+                <wp:inline distT="0" distB="0" distL="0" distR="0">
+                  <wp:extent cx="5560906" cy="2858346"/>
+                  <wp:effectExtent t="0" r="0" b="0" l="0"/>
+                  <wp:docPr id="1" name="" descr="" title=""/>
+                  <wp:cNvGraphicFramePr>
+                    <a:graphicFrameLocks noChangeAspect="1"/>
+                  </wp:cNvGraphicFramePr>
+                  <a:graphic>
+                    <a:graphicData uri="http://schemas.openxmlformats.org/drawingml/2006/picture">
+                      <pic:pic>
+                        <pic:nvPicPr>
+                          <pic:cNvPr id="0" name="" descr=""/>
+                          <pic:cNvPicPr>
+                            <a:picLocks noChangeAspect="1" noChangeArrowheads="1"/>
+                          </pic:cNvPicPr>
+                        </pic:nvPicPr>
+                        <pic:blipFill>
+                          <a:blip r:embed="rId13" cstate="none"/>
+                          <a:srcRect/>
+                          <a:stretch>
+                            <a:fillRect/>
+                          </a:stretch>
+                        </pic:blipFill>
+                        <pic:spPr bwMode="auto">
+                          <a:xfrm>
+                            <a:off x="0" y="0"/>
+                            <a:ext cx="5560906" cy="2858346"/>
+                          </a:xfrm>
+                          <a:prstGeom prst="rect">
+                            <a:avLst/>
+                          </a:prstGeom>
+                        </pic:spPr>
+                      </pic:pic>
+                    </a:graphicData>
+                  </a:graphic>
+                </wp:inline>
+              </w:drawing>
+            </w:r>
+          </w:p>
+          <w:p>
+            <w:pPr>
+              <w:widowControl w:val="1"/>
+              <w:spacing w:line="240" w:lineRule="auto" w:after="100"/>
+              <w:rPr>
+                <w:color w:val="1155cc"/>
+                <w:sz w:val="20"/>
+                <w:szCs w:val="20"/>
+              </w:rPr>
+            </w:pPr>
+            <w:r>
+              <w:rPr>
+                <w:color w:val="5B6B77"/>
+                <w:iCs/>
+                <w:i/>
+                <w:sz w:val="20"/>
+                <w:szCs w:val="20"/>
+                <w:rtl w:val="0"/>
+              </w:rPr>
+              <w:t xml:space="preserve">Captura real: shred fa 4 passades sobre el disc; grep ja no troba cap coincidència (0) i el disc ja no es pot muntar.</w:t>
+            </w:r>
+          </w:p>
+          <w:p>
+            <w:pPr>
+              <w:widowControl w:val="1"/>
+              <w:spacing w:line="240" w:lineRule="auto" w:after="100"/>
+              <w:rPr>
+                <w:color w:val="1155cc"/>
+                <w:sz w:val="20"/>
+                <w:szCs w:val="20"/>
+              </w:rPr>
+            </w:pPr>
+            <w:r>
+              <w:rPr>
+                <w:bCs/>
+                <w:b/>
+                <w:sz w:val="20"/>
+                <w:szCs w:val="20"/>
+                <w:rtl w:val="0"/>
+              </w:rPr>
+              <w:t xml:space="preserve">Pas 5. </w:t>
+            </w:r>
+            <w:r>
+              <w:rPr>
+                <w:sz w:val="20"/>
+                <w:szCs w:val="20"/>
+                <w:rtl w:val="0"/>
+              </w:rPr>
+              <w:t xml:space="preserve">Repàs de RA1: a l'activitat de Seguretat lògica vas xifrar fitxers amb GPG. Crea un fitxer de prova, xifra'l amb una contrasenya (introdueix-la quan te la demani), comprova que el resultat és un fitxer xifrat, esborra l'original i recupera'n el contingut desxifrant-lo. [CAPTURA]</w:t>
+            </w:r>
+          </w:p>
+          <w:p>
+            <w:pPr>
+              <w:pBdr>
+                <w:top w:val="single" w:color="CADCE8" w:sz="4"/>
+                <w:bottom w:val="single" w:color="CADCE8" w:sz="4"/>
+                <w:left w:val="single" w:color="CADCE8" w:sz="4"/>
+                <w:right w:val="single" w:color="CADCE8" w:sz="4"/>
+              </w:pBdr>
+              <w:shd w:fill="F4F7F9" w:val="clear"/>
+              <w:spacing w:after="160" w:before="80"/>
+              <w:jc w:val="left"/>
+            </w:pPr>
+            <w:r>
+              <w:rPr>
+                <w:rFonts w:ascii="Consolas" w:cs="Consolas" w:eastAsia="Consolas" w:hAnsi="Consolas"/>
+                <w:sz w:val="19"/>
+                <w:szCs w:val="19"/>
+              </w:rPr>
+              <w:t xml:space="preserve">echo "Notes del grup SMX2C - CONFIDENCIAL" &gt; notes2.txt</w:t>
+            </w:r>
+            <w:r>
+              <w:br/>
+              <w:t xml:space="preserve"/>
+            </w:r>
+            <w:r>
+              <w:rPr>
+                <w:rFonts w:ascii="Consolas" w:cs="Consolas" w:eastAsia="Consolas" w:hAnsi="Consolas"/>
+                <w:sz w:val="19"/>
+                <w:szCs w:val="19"/>
+              </w:rPr>
+              <w:t xml:space="preserve">gpg -c notes2.txt</w:t>
+            </w:r>
+            <w:r>
+              <w:br/>
+              <w:t xml:space="preserve"/>
+            </w:r>
+            <w:r>
+              <w:rPr>
+                <w:rFonts w:ascii="Consolas" w:cs="Consolas" w:eastAsia="Consolas" w:hAnsi="Consolas"/>
+                <w:sz w:val="19"/>
+                <w:szCs w:val="19"/>
+              </w:rPr>
+              <w:t xml:space="preserve">ls -l notes2.txt*</w:t>
+            </w:r>
+            <w:r>
+              <w:br/>
+              <w:t xml:space="preserve"/>
+            </w:r>
+            <w:r>
+              <w:rPr>
+                <w:rFonts w:ascii="Consolas" w:cs="Consolas" w:eastAsia="Consolas" w:hAnsi="Consolas"/>
+                <w:sz w:val="19"/>
+                <w:szCs w:val="19"/>
+              </w:rPr>
+              <w:t xml:space="preserve">file notes2.txt.gpg</w:t>
+            </w:r>
+            <w:r>
+              <w:br/>
+              <w:t xml:space="preserve"/>
+            </w:r>
+            <w:r>
+              <w:rPr>
+                <w:rFonts w:ascii="Consolas" w:cs="Consolas" w:eastAsia="Consolas" w:hAnsi="Consolas"/>
+                <w:sz w:val="19"/>
+                <w:szCs w:val="19"/>
+              </w:rPr>
+              <w:t xml:space="preserve">rm notes2.txt</w:t>
+            </w:r>
+            <w:r>
+              <w:br/>
+              <w:t xml:space="preserve"/>
+            </w:r>
+            <w:r>
+              <w:rPr>
+                <w:rFonts w:ascii="Consolas" w:cs="Consolas" w:eastAsia="Consolas" w:hAnsi="Consolas"/>
+                <w:sz w:val="19"/>
+                <w:szCs w:val="19"/>
+              </w:rPr>
+              <w:t xml:space="preserve">gpg -d notes2.txt.gpg</w:t>
+            </w:r>
+          </w:p>
+          <w:p>
+            <w:pPr>
+              <w:widowControl w:val="1"/>
+              <w:spacing w:line="240" w:lineRule="auto" w:after="100"/>
+              <w:rPr>
+                <w:color w:val="1155cc"/>
+                <w:sz w:val="20"/>
+                <w:szCs w:val="20"/>
+              </w:rPr>
+            </w:pPr>
+            <w:r>
+              <w:rPr>
+                <w:sz w:val="20"/>
+                <w:szCs w:val="20"/>
+                <w:rtl w:val="0"/>
+              </w:rPr>
+              <w:drawing>
+                <wp:inline distT="0" distB="0" distL="0" distR="0">
+                  <wp:extent cx="5669280" cy="3972442"/>
+                  <wp:effectExtent t="0" r="0" b="0" l="0"/>
+                  <wp:docPr id="1" name="" descr="" title=""/>
+                  <wp:cNvGraphicFramePr>
+                    <a:graphicFrameLocks noChangeAspect="1"/>
+                  </wp:cNvGraphicFramePr>
+                  <a:graphic>
+                    <a:graphicData uri="http://schemas.openxmlformats.org/drawingml/2006/picture">
+                      <pic:pic>
+                        <pic:nvPicPr>
+                          <pic:cNvPr id="0" name="" descr=""/>
+                          <pic:cNvPicPr>
+                            <a:picLocks noChangeAspect="1" noChangeArrowheads="1"/>
+                          </pic:cNvPicPr>
+                        </pic:nvPicPr>
+                        <pic:blipFill>
+                          <a:blip r:embed="rId14" cstate="none"/>
+                          <a:srcRect/>
+                          <a:stretch>
+                            <a:fillRect/>
+                          </a:stretch>
+                        </pic:blipFill>
+                        <pic:spPr bwMode="auto">
+                          <a:xfrm>
+                            <a:off x="0" y="0"/>
+                            <a:ext cx="5669280" cy="3972442"/>
+                          </a:xfrm>
+                          <a:prstGeom prst="rect">
+                            <a:avLst/>
+                          </a:prstGeom>
+                        </pic:spPr>
+                      </pic:pic>
+                    </a:graphicData>
+                  </a:graphic>
+                </wp:inline>
+              </w:drawing>
+            </w:r>
+          </w:p>
+          <w:p>
+            <w:pPr>
+              <w:widowControl w:val="1"/>
+              <w:spacing w:line="240" w:lineRule="auto" w:after="100"/>
+              <w:rPr>
+                <w:color w:val="1155cc"/>
+                <w:sz w:val="20"/>
+                <w:szCs w:val="20"/>
+              </w:rPr>
+            </w:pPr>
+            <w:r>
+              <w:rPr>
+                <w:color w:val="5B6B77"/>
+                <w:iCs/>
+                <w:i/>
+                <w:sz w:val="20"/>
+                <w:szCs w:val="20"/>
+                <w:rtl w:val="0"/>
+              </w:rPr>
+              <w:t xml:space="preserve">Captura real: xifratge simètric amb GPG (AES-256), esborrat de l'original i desxifratge amb la contrasenya.</w:t>
+            </w:r>
+          </w:p>
+          <w:p>
+            <w:pPr>
+              <w:widowControl w:val="1"/>
+              <w:spacing w:line="240" w:lineRule="auto" w:after="0" w:before="0"/>
+              <w:rPr>
+                <w:color w:val="1155cc"/>
+                <w:sz w:val="20"/>
+                <w:szCs w:val="20"/>
+              </w:rPr>
+            </w:pPr>
+            <w:r>
+              <w:rPr>
+                <w:sz w:val="20"/>
+                <w:szCs w:val="20"/>
+                <w:rtl w:val="0"/>
+              </w:rPr>
+              <w:t xml:space="preserve">Respon:</w:t>
+            </w:r>
+          </w:p>
+          <w:p>
+            <w:pPr>
+              <w:widowControl w:val="1"/>
+              <w:spacing w:line="240" w:lineRule="auto" w:after="0" w:before="100"/>
+              <w:ind w:left="340" w:hanging="340"/>
+              <w:rPr>
+                <w:color w:val="1155cc"/>
+                <w:sz w:val="20"/>
+                <w:szCs w:val="20"/>
+              </w:rPr>
+            </w:pPr>
+            <w:r>
+              <w:rPr>
+                <w:bCs/>
+                <w:b/>
+                <w:sz w:val="20"/>
+                <w:szCs w:val="20"/>
+                <w:rtl w:val="0"/>
+              </w:rPr>
+              <w:t xml:space="preserve">a) </w:t>
+            </w:r>
+            <w:r>
+              <w:rPr>
+                <w:sz w:val="20"/>
+                <w:szCs w:val="20"/>
+                <w:rtl w:val="0"/>
+              </w:rPr>
+              <w:t xml:space="preserve">Què fa realment rm amb les dades d'un fitxer? Relaciona-ho amb el que diu el temari sobre l'opció "Esborra" i el format ràpid.</w:t>
+            </w:r>
+          </w:p>
+          <w:p>
+            <w:pPr>
+              <w:widowControl w:val="1"/>
+              <w:spacing w:line="240" w:lineRule="auto" w:after="0" w:before="100"/>
+              <w:ind w:left="340" w:hanging="340"/>
+              <w:rPr>
+                <w:color w:val="1155cc"/>
+                <w:sz w:val="20"/>
+                <w:szCs w:val="20"/>
+              </w:rPr>
+            </w:pPr>
+            <w:r>
+              <w:rPr>
+                <w:bCs/>
+                <w:b/>
+                <w:sz w:val="20"/>
+                <w:szCs w:val="20"/>
+                <w:rtl w:val="0"/>
+              </w:rPr>
+              <w:t xml:space="preserve">b) </w:t>
+            </w:r>
+            <w:r>
+              <w:rPr>
+                <w:sz w:val="20"/>
+                <w:szCs w:val="20"/>
+                <w:rtl w:val="0"/>
+              </w:rPr>
+              <w:t xml:space="preserve">Quina de les tres tècniques de destrucció segura del temari has aplicat al Pas 4? En què s'assembla a l'estàndard DoD 5220.22-M?</w:t>
+            </w:r>
+          </w:p>
+          <w:p>
+            <w:pPr>
+              <w:widowControl w:val="1"/>
+              <w:spacing w:line="240" w:lineRule="auto" w:after="0" w:before="100"/>
+              <w:ind w:left="340" w:hanging="340"/>
+              <w:rPr>
+                <w:color w:val="1155cc"/>
+                <w:sz w:val="20"/>
+                <w:szCs w:val="20"/>
+              </w:rPr>
+            </w:pPr>
+            <w:r>
+              <w:rPr>
+                <w:bCs/>
+                <w:b/>
+                <w:sz w:val="20"/>
+                <w:szCs w:val="20"/>
+                <w:rtl w:val="0"/>
+              </w:rPr>
+              <w:t xml:space="preserve">c) </w:t>
+            </w:r>
+            <w:r>
+              <w:rPr>
+                <w:sz w:val="20"/>
+                <w:szCs w:val="20"/>
+                <w:rtl w:val="0"/>
+              </w:rPr>
+              <w:t xml:space="preserve">Per què el disc ja no es pot muntar després del Pas 4? Seria una bona opció si es volgués reutilitzar el disc?</w:t>
+            </w:r>
+          </w:p>
+          <w:p>
+            <w:pPr>
+              <w:widowControl w:val="1"/>
+              <w:spacing w:line="240" w:lineRule="auto" w:after="0" w:before="100"/>
+              <w:ind w:left="340" w:hanging="340"/>
+              <w:rPr>
+                <w:color w:val="1155cc"/>
+                <w:sz w:val="20"/>
+                <w:szCs w:val="20"/>
+              </w:rPr>
+            </w:pPr>
+            <w:r>
+              <w:rPr>
+                <w:bCs/>
+                <w:b/>
+                <w:sz w:val="20"/>
+                <w:szCs w:val="20"/>
+                <w:rtl w:val="0"/>
+              </w:rPr>
+              <w:t xml:space="preserve">d) </w:t>
+            </w:r>
+            <w:r>
+              <w:rPr>
+                <w:sz w:val="20"/>
+                <w:szCs w:val="20"/>
+                <w:rtl w:val="0"/>
+              </w:rPr>
+              <w:t xml:space="preserve">Per què shred no garanteix la destrucció de les dades en un SSD o en un llapis USB? (Pista: cerca què són el wear leveling i el TRIM.)</w:t>
+            </w:r>
+          </w:p>
+          <w:p>
+            <w:pPr>
+              <w:widowControl w:val="1"/>
+              <w:spacing w:line="240" w:lineRule="auto" w:after="100" w:before="100"/>
+              <w:ind w:left="340" w:hanging="340"/>
+              <w:rPr>
+                <w:color w:val="1155cc"/>
+                <w:sz w:val="20"/>
+                <w:szCs w:val="20"/>
+              </w:rPr>
+            </w:pPr>
+            <w:r>
+              <w:rPr>
+                <w:bCs/>
+                <w:b/>
+                <w:sz w:val="20"/>
+                <w:szCs w:val="20"/>
+                <w:rtl w:val="0"/>
+              </w:rPr>
+              <w:t xml:space="preserve">e) </w:t>
+            </w:r>
+            <w:r>
+              <w:rPr>
+                <w:sz w:val="20"/>
+                <w:szCs w:val="20"/>
+                <w:rtl w:val="0"/>
+              </w:rPr>
+              <w:t xml:space="preserve">Si les notes de la Marta s'haguessin desat xifrades amb GPG, què hauria trobat grep al Pas 3? El xifratge substitueix la destrucció segura o la complementa?</w:t>
+            </w:r>
+          </w:p>
+        </w:tc>
+      </w:tr>
+    </w:tbl>
+    <w:p>
+      <w:pPr>
+        <w:rPr/>
+      </w:pPr>
+      <w:r>
+        <w:rPr>
+          <w:rtl w:val="0"/>
+        </w:rPr>
+      </w:r>
+    </w:p>
     <w:p>
       <w:pPr>
         <w:spacing w:before="200" w:line="276" w:lineRule="auto"/>
@@ -1688,7 +3088,7 @@
         </w:rPr>
         <w:t xml:space="preserve">Fonts: Repositori "Materials" (GitHub, SMX-0226SI), </w:t>
       </w:r>
-      <w:hyperlink r:id="rId2">
+      <w:hyperlink r:id="rId15">
         <w:r>
           <w:rPr>
             <w:i w:val="1"/>
@@ -1711,7 +3111,7 @@
         </w:rPr>
         <w:t xml:space="preserve"> — Carlos Alonso Martínez, Escola Pia de Mataró (CC-BY-SA-4.0); PCMag, </w:t>
       </w:r>
-      <w:hyperlink r:id="rId9">
+      <w:hyperlink r:id="rId16">
         <w:r>
           <w:rPr>
             <w:i w:val="1"/>
@@ -1734,7 +3134,7 @@
         </w:rPr>
         <w:t xml:space="preserve"> (2019); IONOS Digital Guide, </w:t>
       </w:r>
-      <w:hyperlink r:id="rId10">
+      <w:hyperlink r:id="rId17">
         <w:r>
           <w:rPr>
             <w:i w:val="1"/>

</xml_diff>